<commit_message>
Indention on Notes bullet point bug, Edit Notes, bullet point bug in editor
</commit_message>
<xml_diff>
--- a/notes/lawyering_skills_and_strategies/Memo.docx
+++ b/notes/lawyering_skills_and_strategies/Memo.docx
@@ -1745,10 +1745,10 @@
       </w:tblPr>
       <w:tblGrid>
         <w:gridCol w:w="1994"/>
-        <w:gridCol w:w="1993"/>
-        <w:gridCol w:w="1996"/>
-        <w:gridCol w:w="1993"/>
-        <w:gridCol w:w="1996"/>
+        <w:gridCol w:w="1992"/>
+        <w:gridCol w:w="1997"/>
+        <w:gridCol w:w="1992"/>
+        <w:gridCol w:w="1997"/>
       </w:tblGrid>
       <w:tr>
         <w:trPr/>
@@ -1774,7 +1774,7 @@
         </w:tc>
         <w:tc>
           <w:tcPr>
-            <w:tcW w:w="1993" w:type="dxa"/>
+            <w:tcW w:w="1992" w:type="dxa"/>
             <w:tcBorders>
               <w:top w:val="single" w:sz="4" w:space="0" w:color="000000"/>
               <w:left w:val="single" w:sz="4" w:space="0" w:color="000000"/>
@@ -1795,7 +1795,7 @@
         </w:tc>
         <w:tc>
           <w:tcPr>
-            <w:tcW w:w="1996" w:type="dxa"/>
+            <w:tcW w:w="1997" w:type="dxa"/>
             <w:tcBorders>
               <w:top w:val="single" w:sz="4" w:space="0" w:color="000000"/>
               <w:left w:val="single" w:sz="4" w:space="0" w:color="000000"/>
@@ -1816,7 +1816,7 @@
         </w:tc>
         <w:tc>
           <w:tcPr>
-            <w:tcW w:w="1993" w:type="dxa"/>
+            <w:tcW w:w="1992" w:type="dxa"/>
             <w:tcBorders>
               <w:top w:val="single" w:sz="4" w:space="0" w:color="000000"/>
               <w:left w:val="single" w:sz="4" w:space="0" w:color="000000"/>
@@ -1837,7 +1837,7 @@
         </w:tc>
         <w:tc>
           <w:tcPr>
-            <w:tcW w:w="1996" w:type="dxa"/>
+            <w:tcW w:w="1997" w:type="dxa"/>
             <w:tcBorders>
               <w:top w:val="single" w:sz="4" w:space="0" w:color="000000"/>
               <w:left w:val="single" w:sz="4" w:space="0" w:color="000000"/>
@@ -1882,7 +1882,7 @@
         </w:tc>
         <w:tc>
           <w:tcPr>
-            <w:tcW w:w="1993" w:type="dxa"/>
+            <w:tcW w:w="1992" w:type="dxa"/>
             <w:tcBorders>
               <w:left w:val="single" w:sz="4" w:space="0" w:color="000000"/>
               <w:bottom w:val="single" w:sz="4" w:space="0" w:color="000000"/>
@@ -1902,7 +1902,7 @@
         </w:tc>
         <w:tc>
           <w:tcPr>
-            <w:tcW w:w="1996" w:type="dxa"/>
+            <w:tcW w:w="1997" w:type="dxa"/>
             <w:tcBorders>
               <w:left w:val="single" w:sz="4" w:space="0" w:color="000000"/>
               <w:bottom w:val="single" w:sz="4" w:space="0" w:color="000000"/>
@@ -1922,7 +1922,7 @@
         </w:tc>
         <w:tc>
           <w:tcPr>
-            <w:tcW w:w="1993" w:type="dxa"/>
+            <w:tcW w:w="1992" w:type="dxa"/>
             <w:tcBorders>
               <w:left w:val="single" w:sz="4" w:space="0" w:color="000000"/>
               <w:bottom w:val="single" w:sz="4" w:space="0" w:color="000000"/>
@@ -1942,7 +1942,7 @@
         </w:tc>
         <w:tc>
           <w:tcPr>
-            <w:tcW w:w="1996" w:type="dxa"/>
+            <w:tcW w:w="1997" w:type="dxa"/>
             <w:tcBorders>
               <w:left w:val="single" w:sz="4" w:space="0" w:color="000000"/>
               <w:bottom w:val="single" w:sz="4" w:space="0" w:color="000000"/>
@@ -1986,7 +1986,7 @@
         </w:tc>
         <w:tc>
           <w:tcPr>
-            <w:tcW w:w="1993" w:type="dxa"/>
+            <w:tcW w:w="1992" w:type="dxa"/>
             <w:tcBorders>
               <w:left w:val="single" w:sz="4" w:space="0" w:color="000000"/>
               <w:bottom w:val="single" w:sz="4" w:space="0" w:color="000000"/>
@@ -2006,7 +2006,7 @@
         </w:tc>
         <w:tc>
           <w:tcPr>
-            <w:tcW w:w="1996" w:type="dxa"/>
+            <w:tcW w:w="1997" w:type="dxa"/>
             <w:tcBorders>
               <w:left w:val="single" w:sz="4" w:space="0" w:color="000000"/>
               <w:bottom w:val="single" w:sz="4" w:space="0" w:color="000000"/>
@@ -2026,7 +2026,7 @@
         </w:tc>
         <w:tc>
           <w:tcPr>
-            <w:tcW w:w="1993" w:type="dxa"/>
+            <w:tcW w:w="1992" w:type="dxa"/>
             <w:tcBorders>
               <w:left w:val="single" w:sz="4" w:space="0" w:color="000000"/>
               <w:bottom w:val="single" w:sz="4" w:space="0" w:color="000000"/>
@@ -2046,7 +2046,7 @@
         </w:tc>
         <w:tc>
           <w:tcPr>
-            <w:tcW w:w="1996" w:type="dxa"/>
+            <w:tcW w:w="1997" w:type="dxa"/>
             <w:tcBorders>
               <w:left w:val="single" w:sz="4" w:space="0" w:color="000000"/>
               <w:bottom w:val="single" w:sz="4" w:space="0" w:color="000000"/>
@@ -2090,7 +2090,7 @@
         </w:tc>
         <w:tc>
           <w:tcPr>
-            <w:tcW w:w="1993" w:type="dxa"/>
+            <w:tcW w:w="1992" w:type="dxa"/>
             <w:tcBorders>
               <w:left w:val="single" w:sz="4" w:space="0" w:color="000000"/>
               <w:bottom w:val="single" w:sz="4" w:space="0" w:color="000000"/>
@@ -2110,7 +2110,7 @@
         </w:tc>
         <w:tc>
           <w:tcPr>
-            <w:tcW w:w="1996" w:type="dxa"/>
+            <w:tcW w:w="1997" w:type="dxa"/>
             <w:tcBorders>
               <w:left w:val="single" w:sz="4" w:space="0" w:color="000000"/>
               <w:bottom w:val="single" w:sz="4" w:space="0" w:color="000000"/>
@@ -2130,7 +2130,7 @@
         </w:tc>
         <w:tc>
           <w:tcPr>
-            <w:tcW w:w="1993" w:type="dxa"/>
+            <w:tcW w:w="1992" w:type="dxa"/>
             <w:tcBorders>
               <w:left w:val="single" w:sz="4" w:space="0" w:color="000000"/>
               <w:bottom w:val="single" w:sz="4" w:space="0" w:color="000000"/>
@@ -2150,7 +2150,7 @@
         </w:tc>
         <w:tc>
           <w:tcPr>
-            <w:tcW w:w="1996" w:type="dxa"/>
+            <w:tcW w:w="1997" w:type="dxa"/>
             <w:tcBorders>
               <w:left w:val="single" w:sz="4" w:space="0" w:color="000000"/>
               <w:bottom w:val="single" w:sz="4" w:space="0" w:color="000000"/>
@@ -2194,7 +2194,7 @@
         </w:tc>
         <w:tc>
           <w:tcPr>
-            <w:tcW w:w="1993" w:type="dxa"/>
+            <w:tcW w:w="1992" w:type="dxa"/>
             <w:tcBorders>
               <w:left w:val="single" w:sz="4" w:space="0" w:color="000000"/>
               <w:bottom w:val="single" w:sz="4" w:space="0" w:color="000000"/>
@@ -2214,7 +2214,7 @@
         </w:tc>
         <w:tc>
           <w:tcPr>
-            <w:tcW w:w="1996" w:type="dxa"/>
+            <w:tcW w:w="1997" w:type="dxa"/>
             <w:tcBorders>
               <w:left w:val="single" w:sz="4" w:space="0" w:color="000000"/>
               <w:bottom w:val="single" w:sz="4" w:space="0" w:color="000000"/>
@@ -2234,7 +2234,7 @@
         </w:tc>
         <w:tc>
           <w:tcPr>
-            <w:tcW w:w="1993" w:type="dxa"/>
+            <w:tcW w:w="1992" w:type="dxa"/>
             <w:tcBorders>
               <w:left w:val="single" w:sz="4" w:space="0" w:color="000000"/>
               <w:bottom w:val="single" w:sz="4" w:space="0" w:color="000000"/>
@@ -2254,7 +2254,7 @@
         </w:tc>
         <w:tc>
           <w:tcPr>
-            <w:tcW w:w="1996" w:type="dxa"/>
+            <w:tcW w:w="1997" w:type="dxa"/>
             <w:tcBorders>
               <w:left w:val="single" w:sz="4" w:space="0" w:color="000000"/>
               <w:bottom w:val="single" w:sz="4" w:space="0" w:color="000000"/>
@@ -2298,7 +2298,7 @@
         </w:tc>
         <w:tc>
           <w:tcPr>
-            <w:tcW w:w="1993" w:type="dxa"/>
+            <w:tcW w:w="1992" w:type="dxa"/>
             <w:tcBorders>
               <w:left w:val="single" w:sz="4" w:space="0" w:color="000000"/>
               <w:bottom w:val="single" w:sz="4" w:space="0" w:color="000000"/>
@@ -2318,7 +2318,7 @@
         </w:tc>
         <w:tc>
           <w:tcPr>
-            <w:tcW w:w="1996" w:type="dxa"/>
+            <w:tcW w:w="1997" w:type="dxa"/>
             <w:tcBorders>
               <w:left w:val="single" w:sz="4" w:space="0" w:color="000000"/>
               <w:bottom w:val="single" w:sz="4" w:space="0" w:color="000000"/>
@@ -2338,7 +2338,7 @@
         </w:tc>
         <w:tc>
           <w:tcPr>
-            <w:tcW w:w="1993" w:type="dxa"/>
+            <w:tcW w:w="1992" w:type="dxa"/>
             <w:tcBorders>
               <w:left w:val="single" w:sz="4" w:space="0" w:color="000000"/>
               <w:bottom w:val="single" w:sz="4" w:space="0" w:color="000000"/>
@@ -2358,7 +2358,7 @@
         </w:tc>
         <w:tc>
           <w:tcPr>
-            <w:tcW w:w="1996" w:type="dxa"/>
+            <w:tcW w:w="1997" w:type="dxa"/>
             <w:tcBorders>
               <w:left w:val="single" w:sz="4" w:space="0" w:color="000000"/>
               <w:bottom w:val="single" w:sz="4" w:space="0" w:color="000000"/>
@@ -2402,7 +2402,7 @@
         </w:tc>
         <w:tc>
           <w:tcPr>
-            <w:tcW w:w="1993" w:type="dxa"/>
+            <w:tcW w:w="1992" w:type="dxa"/>
             <w:tcBorders>
               <w:left w:val="single" w:sz="4" w:space="0" w:color="000000"/>
               <w:bottom w:val="single" w:sz="4" w:space="0" w:color="000000"/>
@@ -2422,7 +2422,7 @@
         </w:tc>
         <w:tc>
           <w:tcPr>
-            <w:tcW w:w="1996" w:type="dxa"/>
+            <w:tcW w:w="1997" w:type="dxa"/>
             <w:tcBorders>
               <w:left w:val="single" w:sz="4" w:space="0" w:color="000000"/>
               <w:bottom w:val="single" w:sz="4" w:space="0" w:color="000000"/>
@@ -2442,7 +2442,7 @@
         </w:tc>
         <w:tc>
           <w:tcPr>
-            <w:tcW w:w="1993" w:type="dxa"/>
+            <w:tcW w:w="1992" w:type="dxa"/>
             <w:tcBorders>
               <w:left w:val="single" w:sz="4" w:space="0" w:color="000000"/>
               <w:bottom w:val="single" w:sz="4" w:space="0" w:color="000000"/>
@@ -2462,7 +2462,7 @@
         </w:tc>
         <w:tc>
           <w:tcPr>
-            <w:tcW w:w="1996" w:type="dxa"/>
+            <w:tcW w:w="1997" w:type="dxa"/>
             <w:tcBorders>
               <w:left w:val="single" w:sz="4" w:space="0" w:color="000000"/>
               <w:bottom w:val="single" w:sz="4" w:space="0" w:color="000000"/>
@@ -2506,7 +2506,7 @@
         </w:tc>
         <w:tc>
           <w:tcPr>
-            <w:tcW w:w="1993" w:type="dxa"/>
+            <w:tcW w:w="1992" w:type="dxa"/>
             <w:tcBorders>
               <w:left w:val="single" w:sz="4" w:space="0" w:color="000000"/>
               <w:bottom w:val="single" w:sz="4" w:space="0" w:color="000000"/>
@@ -2526,7 +2526,7 @@
         </w:tc>
         <w:tc>
           <w:tcPr>
-            <w:tcW w:w="1996" w:type="dxa"/>
+            <w:tcW w:w="1997" w:type="dxa"/>
             <w:tcBorders>
               <w:left w:val="single" w:sz="4" w:space="0" w:color="000000"/>
               <w:bottom w:val="single" w:sz="4" w:space="0" w:color="000000"/>
@@ -2546,7 +2546,7 @@
         </w:tc>
         <w:tc>
           <w:tcPr>
-            <w:tcW w:w="1993" w:type="dxa"/>
+            <w:tcW w:w="1992" w:type="dxa"/>
             <w:tcBorders>
               <w:left w:val="single" w:sz="4" w:space="0" w:color="000000"/>
               <w:bottom w:val="single" w:sz="4" w:space="0" w:color="000000"/>
@@ -2566,7 +2566,7 @@
         </w:tc>
         <w:tc>
           <w:tcPr>
-            <w:tcW w:w="1996" w:type="dxa"/>
+            <w:tcW w:w="1997" w:type="dxa"/>
             <w:tcBorders>
               <w:left w:val="single" w:sz="4" w:space="0" w:color="000000"/>
               <w:bottom w:val="single" w:sz="4" w:space="0" w:color="000000"/>
@@ -2610,7 +2610,7 @@
         </w:tc>
         <w:tc>
           <w:tcPr>
-            <w:tcW w:w="1993" w:type="dxa"/>
+            <w:tcW w:w="1992" w:type="dxa"/>
             <w:tcBorders>
               <w:left w:val="single" w:sz="4" w:space="0" w:color="000000"/>
               <w:bottom w:val="single" w:sz="4" w:space="0" w:color="000000"/>
@@ -2630,7 +2630,7 @@
         </w:tc>
         <w:tc>
           <w:tcPr>
-            <w:tcW w:w="1996" w:type="dxa"/>
+            <w:tcW w:w="1997" w:type="dxa"/>
             <w:tcBorders>
               <w:left w:val="single" w:sz="4" w:space="0" w:color="000000"/>
               <w:bottom w:val="single" w:sz="4" w:space="0" w:color="000000"/>
@@ -2650,7 +2650,7 @@
         </w:tc>
         <w:tc>
           <w:tcPr>
-            <w:tcW w:w="1993" w:type="dxa"/>
+            <w:tcW w:w="1992" w:type="dxa"/>
             <w:tcBorders>
               <w:left w:val="single" w:sz="4" w:space="0" w:color="000000"/>
               <w:bottom w:val="single" w:sz="4" w:space="0" w:color="000000"/>
@@ -2670,7 +2670,7 @@
         </w:tc>
         <w:tc>
           <w:tcPr>
-            <w:tcW w:w="1996" w:type="dxa"/>
+            <w:tcW w:w="1997" w:type="dxa"/>
             <w:tcBorders>
               <w:left w:val="single" w:sz="4" w:space="0" w:color="000000"/>
               <w:bottom w:val="single" w:sz="4" w:space="0" w:color="000000"/>
@@ -2714,7 +2714,7 @@
         </w:tc>
         <w:tc>
           <w:tcPr>
-            <w:tcW w:w="1993" w:type="dxa"/>
+            <w:tcW w:w="1992" w:type="dxa"/>
             <w:tcBorders>
               <w:left w:val="single" w:sz="4" w:space="0" w:color="000000"/>
               <w:bottom w:val="single" w:sz="4" w:space="0" w:color="000000"/>
@@ -2734,7 +2734,7 @@
         </w:tc>
         <w:tc>
           <w:tcPr>
-            <w:tcW w:w="1996" w:type="dxa"/>
+            <w:tcW w:w="1997" w:type="dxa"/>
             <w:tcBorders>
               <w:left w:val="single" w:sz="4" w:space="0" w:color="000000"/>
               <w:bottom w:val="single" w:sz="4" w:space="0" w:color="000000"/>
@@ -2754,7 +2754,7 @@
         </w:tc>
         <w:tc>
           <w:tcPr>
-            <w:tcW w:w="1993" w:type="dxa"/>
+            <w:tcW w:w="1992" w:type="dxa"/>
             <w:tcBorders>
               <w:left w:val="single" w:sz="4" w:space="0" w:color="000000"/>
               <w:bottom w:val="single" w:sz="4" w:space="0" w:color="000000"/>
@@ -2774,7 +2774,7 @@
         </w:tc>
         <w:tc>
           <w:tcPr>
-            <w:tcW w:w="1996" w:type="dxa"/>
+            <w:tcW w:w="1997" w:type="dxa"/>
             <w:tcBorders>
               <w:left w:val="single" w:sz="4" w:space="0" w:color="000000"/>
               <w:bottom w:val="single" w:sz="4" w:space="0" w:color="000000"/>
@@ -2818,7 +2818,7 @@
         </w:tc>
         <w:tc>
           <w:tcPr>
-            <w:tcW w:w="1993" w:type="dxa"/>
+            <w:tcW w:w="1992" w:type="dxa"/>
             <w:tcBorders>
               <w:left w:val="single" w:sz="4" w:space="0" w:color="000000"/>
               <w:bottom w:val="single" w:sz="4" w:space="0" w:color="000000"/>
@@ -2838,7 +2838,7 @@
         </w:tc>
         <w:tc>
           <w:tcPr>
-            <w:tcW w:w="1996" w:type="dxa"/>
+            <w:tcW w:w="1997" w:type="dxa"/>
             <w:tcBorders>
               <w:left w:val="single" w:sz="4" w:space="0" w:color="000000"/>
               <w:bottom w:val="single" w:sz="4" w:space="0" w:color="000000"/>
@@ -2858,7 +2858,7 @@
         </w:tc>
         <w:tc>
           <w:tcPr>
-            <w:tcW w:w="1993" w:type="dxa"/>
+            <w:tcW w:w="1992" w:type="dxa"/>
             <w:tcBorders>
               <w:left w:val="single" w:sz="4" w:space="0" w:color="000000"/>
               <w:bottom w:val="single" w:sz="4" w:space="0" w:color="000000"/>
@@ -2878,7 +2878,7 @@
         </w:tc>
         <w:tc>
           <w:tcPr>
-            <w:tcW w:w="1996" w:type="dxa"/>
+            <w:tcW w:w="1997" w:type="dxa"/>
             <w:tcBorders>
               <w:left w:val="single" w:sz="4" w:space="0" w:color="000000"/>
               <w:bottom w:val="single" w:sz="4" w:space="0" w:color="000000"/>
@@ -2922,7 +2922,7 @@
         </w:tc>
         <w:tc>
           <w:tcPr>
-            <w:tcW w:w="1993" w:type="dxa"/>
+            <w:tcW w:w="1992" w:type="dxa"/>
             <w:tcBorders>
               <w:left w:val="single" w:sz="4" w:space="0" w:color="000000"/>
               <w:bottom w:val="single" w:sz="4" w:space="0" w:color="000000"/>
@@ -2942,7 +2942,7 @@
         </w:tc>
         <w:tc>
           <w:tcPr>
-            <w:tcW w:w="1996" w:type="dxa"/>
+            <w:tcW w:w="1997" w:type="dxa"/>
             <w:tcBorders>
               <w:left w:val="single" w:sz="4" w:space="0" w:color="000000"/>
               <w:bottom w:val="single" w:sz="4" w:space="0" w:color="000000"/>
@@ -2962,7 +2962,7 @@
         </w:tc>
         <w:tc>
           <w:tcPr>
-            <w:tcW w:w="1993" w:type="dxa"/>
+            <w:tcW w:w="1992" w:type="dxa"/>
             <w:tcBorders>
               <w:left w:val="single" w:sz="4" w:space="0" w:color="000000"/>
               <w:bottom w:val="single" w:sz="4" w:space="0" w:color="000000"/>
@@ -2982,7 +2982,7 @@
         </w:tc>
         <w:tc>
           <w:tcPr>
-            <w:tcW w:w="1996" w:type="dxa"/>
+            <w:tcW w:w="1997" w:type="dxa"/>
             <w:tcBorders>
               <w:left w:val="single" w:sz="4" w:space="0" w:color="000000"/>
               <w:bottom w:val="single" w:sz="4" w:space="0" w:color="000000"/>
@@ -3026,7 +3026,7 @@
         </w:tc>
         <w:tc>
           <w:tcPr>
-            <w:tcW w:w="1993" w:type="dxa"/>
+            <w:tcW w:w="1992" w:type="dxa"/>
             <w:tcBorders>
               <w:left w:val="single" w:sz="4" w:space="0" w:color="000000"/>
               <w:bottom w:val="single" w:sz="4" w:space="0" w:color="000000"/>
@@ -3046,7 +3046,7 @@
         </w:tc>
         <w:tc>
           <w:tcPr>
-            <w:tcW w:w="1996" w:type="dxa"/>
+            <w:tcW w:w="1997" w:type="dxa"/>
             <w:tcBorders>
               <w:left w:val="single" w:sz="4" w:space="0" w:color="000000"/>
               <w:bottom w:val="single" w:sz="4" w:space="0" w:color="000000"/>
@@ -3066,7 +3066,7 @@
         </w:tc>
         <w:tc>
           <w:tcPr>
-            <w:tcW w:w="1993" w:type="dxa"/>
+            <w:tcW w:w="1992" w:type="dxa"/>
             <w:tcBorders>
               <w:left w:val="single" w:sz="4" w:space="0" w:color="000000"/>
               <w:bottom w:val="single" w:sz="4" w:space="0" w:color="000000"/>
@@ -3086,7 +3086,7 @@
         </w:tc>
         <w:tc>
           <w:tcPr>
-            <w:tcW w:w="1996" w:type="dxa"/>
+            <w:tcW w:w="1997" w:type="dxa"/>
             <w:tcBorders>
               <w:left w:val="single" w:sz="4" w:space="0" w:color="000000"/>
               <w:bottom w:val="single" w:sz="4" w:space="0" w:color="000000"/>
@@ -3407,6 +3407,1385 @@
           <w:bCs w:val="false"/>
         </w:rPr>
         <w:t>July 2026: Files suit in Davidson County, defendant removes case</w:t>
+      </w:r>
+    </w:p>
+    <w:p>
+      <w:pPr>
+        <w:pStyle w:val="Normal"/>
+        <w:bidi w:val="0"/>
+        <w:jc w:val="left"/>
+        <w:rPr>
+          <w:b w:val="false"/>
+          <w:b w:val="false"/>
+          <w:bCs w:val="false"/>
+        </w:rPr>
+      </w:pPr>
+      <w:r>
+        <w:rPr/>
+      </w:r>
+    </w:p>
+    <w:p>
+      <w:pPr>
+        <w:pStyle w:val="Normal"/>
+        <w:bidi w:val="0"/>
+        <w:jc w:val="left"/>
+        <w:rPr>
+          <w:b w:val="false"/>
+          <w:b w:val="false"/>
+          <w:bCs w:val="false"/>
+        </w:rPr>
+      </w:pPr>
+      <w:r>
+        <w:rPr>
+          <w:b w:val="false"/>
+          <w:bCs w:val="false"/>
+        </w:rPr>
+        <w:t>Discussion</w:t>
+      </w:r>
+    </w:p>
+    <w:p>
+      <w:pPr>
+        <w:pStyle w:val="Normal"/>
+        <w:bidi w:val="0"/>
+        <w:jc w:val="left"/>
+        <w:rPr>
+          <w:b w:val="false"/>
+          <w:b w:val="false"/>
+          <w:bCs w:val="false"/>
+        </w:rPr>
+      </w:pPr>
+      <w:r>
+        <w:rPr>
+          <w:b w:val="false"/>
+          <w:bCs w:val="false"/>
+        </w:rPr>
+        <w:tab/>
+        <w:t xml:space="preserve">A federal district court may exercise diversity jurisdiction under 28 U.S.C. § 1332(a)(1) only where the amount in controversy exceeds $75,000 and the action between citizens of different states. Diversity must be complete, meaning that no plaintiff may be a citizen of the same state as any defendant. </w:t>
+      </w:r>
+      <w:r>
+        <w:rPr>
+          <w:b w:val="false"/>
+          <w:bCs w:val="false"/>
+        </w:rPr>
+        <w:t xml:space="preserve">Robinette v. Emmons, No. 7:19-CV-2-REW, 2019 WL 13212618, at *1 (E.D. Ky. Jan. 25, 2019). Because the defendant is </w:t>
+      </w:r>
+      <w:r>
+        <w:rPr>
+          <w:b w:val="false"/>
+          <w:bCs w:val="false"/>
+        </w:rPr>
+        <w:t xml:space="preserve">incorporated and headquartered in Tennessee, complete diversity exists  only if Fox was a citizen of Kentucky when the suit was initiated in July 2026. A court will likely conclude that he was not. Fox established domicile in Tennessee when he purchased an apartment in Nashville that he continues to lease. He maintains an active Tennessee voter registration under which he has voted, a Tennessee driver’s license, a Tennessee vehicle registration, and a Nashville based music career. </w:t>
+      </w:r>
+      <w:r>
+        <w:rPr>
+          <w:b w:val="false"/>
+          <w:bCs w:val="false"/>
+        </w:rPr>
+        <w:t>Fox dies not hold a Kentucky voter registration, driver’s license or vehicle registration. Fox has purchased a house in Bowling Green, Kentucky, however, it cannot be considered a new domicile as he only spends one to two nights per week at that residence. The motion to remand is likely to succeed.</w:t>
+      </w:r>
+    </w:p>
+    <w:p>
+      <w:pPr>
+        <w:pStyle w:val="Normal"/>
+        <w:bidi w:val="0"/>
+        <w:jc w:val="left"/>
+        <w:rPr>
+          <w:b w:val="false"/>
+          <w:b w:val="false"/>
+          <w:bCs w:val="false"/>
+        </w:rPr>
+      </w:pPr>
+      <w:r>
+        <w:rPr/>
+      </w:r>
+    </w:p>
+    <w:p>
+      <w:pPr>
+        <w:pStyle w:val="Normal"/>
+        <w:bidi w:val="0"/>
+        <w:jc w:val="left"/>
+        <w:rPr>
+          <w:b w:val="false"/>
+          <w:b w:val="false"/>
+          <w:bCs w:val="false"/>
+        </w:rPr>
+      </w:pPr>
+      <w:r>
+        <w:rPr>
+          <w:b w:val="false"/>
+          <w:bCs w:val="false"/>
+        </w:rPr>
+        <w:tab/>
+        <w:t xml:space="preserve">A. </w:t>
+      </w:r>
+      <w:r>
+        <w:rPr>
+          <w:b w:val="false"/>
+          <w:bCs w:val="false"/>
+        </w:rPr>
+        <w:t xml:space="preserve">The defendant bears the burden as abandoning his Tennessee domicile and acquired a new </w:t>
+        <w:tab/>
+        <w:t>one in Kentucky</w:t>
+      </w:r>
+    </w:p>
+    <w:p>
+      <w:pPr>
+        <w:pStyle w:val="Normal"/>
+        <w:bidi w:val="0"/>
+        <w:jc w:val="left"/>
+        <w:rPr>
+          <w:b w:val="false"/>
+          <w:b w:val="false"/>
+          <w:bCs w:val="false"/>
+        </w:rPr>
+      </w:pPr>
+      <w:r>
+        <w:rPr/>
+      </w:r>
+    </w:p>
+    <w:p>
+      <w:pPr>
+        <w:pStyle w:val="Normal"/>
+        <w:bidi w:val="0"/>
+        <w:jc w:val="left"/>
+        <w:rPr>
+          <w:b w:val="false"/>
+          <w:b w:val="false"/>
+          <w:bCs w:val="false"/>
+        </w:rPr>
+      </w:pPr>
+      <w:r>
+        <w:rPr>
+          <w:b w:val="false"/>
+          <w:bCs w:val="false"/>
+        </w:rPr>
+        <w:tab/>
+        <w:t xml:space="preserve">Federal courts are courts of limited jurisdiction and the burden of establishing a jurisdictional basis rests upon the party asserting jurisdiction. </w:t>
+      </w:r>
+      <w:r>
+        <w:rPr>
+          <w:b w:val="false"/>
+          <w:bCs w:val="false"/>
+          <w:i/>
+          <w:iCs/>
+        </w:rPr>
+        <w:t>Robinette</w:t>
+      </w:r>
+      <w:r>
+        <w:rPr>
+          <w:b w:val="false"/>
+          <w:bCs w:val="false"/>
+        </w:rPr>
+        <w:t xml:space="preserve">, 2019 WL 13212618 at *1 (citing </w:t>
+      </w:r>
+      <w:r>
+        <w:rPr>
+          <w:b w:val="false"/>
+          <w:bCs w:val="false"/>
+          <w:i/>
+          <w:iCs/>
+        </w:rPr>
+        <w:t>Kokkonen</w:t>
+      </w:r>
+      <w:r>
+        <w:rPr>
+          <w:b w:val="false"/>
+          <w:bCs w:val="false"/>
+        </w:rPr>
+        <w:t xml:space="preserve"> v. Guardian Life Ins. Co. of Am., 114 S. Ct. 1673, 1675 (1994)). In </w:t>
+      </w:r>
+      <w:r>
+        <w:rPr>
+          <w:b w:val="false"/>
+          <w:bCs w:val="false"/>
+          <w:i/>
+          <w:iCs/>
+        </w:rPr>
+        <w:t>Robinette</w:t>
+      </w:r>
+      <w:r>
+        <w:rPr>
+          <w:b w:val="false"/>
+          <w:bCs w:val="false"/>
+        </w:rPr>
+        <w:t xml:space="preserve">, </w:t>
+      </w:r>
+      <w:r>
+        <w:rPr>
+          <w:b w:val="false"/>
+          <w:bCs w:val="false"/>
+          <w:i w:val="false"/>
+          <w:iCs w:val="false"/>
+        </w:rPr>
+        <w:t xml:space="preserve">the court required the removing defendant to present affirmative proof of the disputed party’s citizenship in order to retain the case. This case differed from Deasy and Pitt Excavating, in which the plaintiff had invoked </w:t>
+      </w:r>
+      <w:r>
+        <w:rPr>
+          <w:b w:val="false"/>
+          <w:bCs w:val="false"/>
+          <w:i w:val="false"/>
+          <w:iCs w:val="false"/>
+        </w:rPr>
+        <w:t xml:space="preserve">§ 1332, </w:t>
+      </w:r>
+      <w:r>
+        <w:rPr>
+          <w:b w:val="false"/>
+          <w:bCs w:val="false"/>
+          <w:i w:val="false"/>
+          <w:iCs w:val="false"/>
+        </w:rPr>
+        <w:t xml:space="preserve">thus Deasy was required to prove his domicile. Since Fox chose a Tennessee court, he does need to prove his own citizenship. </w:t>
+      </w:r>
+    </w:p>
+    <w:p>
+      <w:pPr>
+        <w:pStyle w:val="Normal"/>
+        <w:bidi w:val="0"/>
+        <w:jc w:val="left"/>
+        <w:rPr>
+          <w:b w:val="false"/>
+          <w:b w:val="false"/>
+          <w:bCs w:val="false"/>
+        </w:rPr>
+      </w:pPr>
+      <w:r>
+        <w:rPr>
+          <w:b w:val="false"/>
+          <w:bCs w:val="false"/>
+          <w:i w:val="false"/>
+          <w:iCs w:val="false"/>
+        </w:rPr>
+        <w:tab/>
+      </w:r>
+      <w:r>
+        <w:rPr>
+          <w:b w:val="false"/>
+          <w:bCs w:val="false"/>
+          <w:i w:val="false"/>
+          <w:iCs w:val="false"/>
+        </w:rPr>
+        <w:t xml:space="preserve">State citizenship for diversity purposes is equated with domicile. </w:t>
+      </w:r>
+      <w:r>
+        <w:rPr>
+          <w:b w:val="false"/>
+          <w:bCs w:val="false"/>
+          <w:i/>
+          <w:iCs/>
+        </w:rPr>
+        <w:t>Pitt Excavating, LLC v. Pitt</w:t>
+      </w:r>
+      <w:r>
+        <w:rPr>
+          <w:b w:val="false"/>
+          <w:bCs w:val="false"/>
+          <w:i w:val="false"/>
+          <w:iCs w:val="false"/>
+        </w:rPr>
+        <w:t>, 603 F. Appx 393, 396 (6</w:t>
+      </w:r>
+      <w:r>
+        <w:rPr>
+          <w:b w:val="false"/>
+          <w:bCs w:val="false"/>
+          <w:i w:val="false"/>
+          <w:iCs w:val="false"/>
+          <w:vertAlign w:val="superscript"/>
+        </w:rPr>
+        <w:t>th</w:t>
+      </w:r>
+      <w:r>
+        <w:rPr>
+          <w:b w:val="false"/>
+          <w:bCs w:val="false"/>
+          <w:i w:val="false"/>
+          <w:iCs w:val="false"/>
+        </w:rPr>
+        <w:t xml:space="preserve"> Cir. 2015) (citing </w:t>
+      </w:r>
+      <w:r>
+        <w:rPr>
+          <w:b w:val="false"/>
+          <w:bCs w:val="false"/>
+          <w:i/>
+          <w:iCs/>
+        </w:rPr>
+        <w:t>Von Dunser v. Aronoff</w:t>
+      </w:r>
+      <w:r>
+        <w:rPr>
+          <w:b w:val="false"/>
+          <w:bCs w:val="false"/>
+          <w:i w:val="false"/>
+          <w:iCs w:val="false"/>
+        </w:rPr>
+        <w:t>, 915 F.2d 1071, 1072 (6</w:t>
+      </w:r>
+      <w:r>
+        <w:rPr>
+          <w:b w:val="false"/>
+          <w:bCs w:val="false"/>
+          <w:i w:val="false"/>
+          <w:iCs w:val="false"/>
+          <w:vertAlign w:val="superscript"/>
+        </w:rPr>
+        <w:t>th</w:t>
+      </w:r>
+      <w:r>
+        <w:rPr>
+          <w:b w:val="false"/>
+          <w:bCs w:val="false"/>
+          <w:i w:val="false"/>
+          <w:iCs w:val="false"/>
+        </w:rPr>
+        <w:t xml:space="preserve"> Cir. 1990)). Residence is not synonymous with citizenship. </w:t>
+      </w:r>
+      <w:r>
+        <w:rPr>
+          <w:b w:val="false"/>
+          <w:bCs w:val="false"/>
+          <w:i/>
+          <w:iCs/>
+        </w:rPr>
+        <w:t>Robinette</w:t>
+      </w:r>
+      <w:r>
+        <w:rPr>
+          <w:b w:val="false"/>
+          <w:bCs w:val="false"/>
+          <w:i w:val="false"/>
+          <w:iCs w:val="false"/>
+        </w:rPr>
+        <w:t xml:space="preserve">, 2019 WL 13212618, at *1 (citing </w:t>
+      </w:r>
+      <w:r>
+        <w:rPr>
+          <w:b w:val="false"/>
+          <w:bCs w:val="false"/>
+          <w:i/>
+          <w:iCs/>
+        </w:rPr>
+        <w:t>Kaiser v. Loomis</w:t>
+      </w:r>
+      <w:r>
+        <w:rPr>
+          <w:b w:val="false"/>
+          <w:bCs w:val="false"/>
+          <w:i w:val="false"/>
+          <w:iCs w:val="false"/>
+        </w:rPr>
+        <w:t>, 391 F.2d 1007, 1009 (6</w:t>
+      </w:r>
+      <w:r>
+        <w:rPr>
+          <w:b w:val="false"/>
+          <w:bCs w:val="false"/>
+          <w:i w:val="false"/>
+          <w:iCs w:val="false"/>
+          <w:vertAlign w:val="superscript"/>
+        </w:rPr>
+        <w:t>th</w:t>
+      </w:r>
+      <w:r>
+        <w:rPr>
+          <w:b w:val="false"/>
+          <w:bCs w:val="false"/>
+          <w:i w:val="false"/>
+          <w:iCs w:val="false"/>
+        </w:rPr>
+        <w:t xml:space="preserve"> Cir. 1968)). </w:t>
+      </w:r>
+      <w:r>
+        <w:rPr>
+          <w:b w:val="false"/>
+          <w:bCs w:val="false"/>
+          <w:i w:val="false"/>
+          <w:iCs w:val="false"/>
+        </w:rPr>
+        <w:t>Meaning a person can reside in one state while being domiciled in another. To establish domicile within a particular state, a person must be physically present in the state and must have either the intention to make his home there indefinitely or the absence of intention to make his home elsewhere. Pitt Excavating,, 603 F. Appx 393 (citing Stifel v Hopkins, 477 F.2d 1116, 1120 (6</w:t>
+      </w:r>
+      <w:r>
+        <w:rPr>
+          <w:b w:val="false"/>
+          <w:bCs w:val="false"/>
+          <w:i w:val="false"/>
+          <w:iCs w:val="false"/>
+          <w:vertAlign w:val="superscript"/>
+        </w:rPr>
+        <w:t>th</w:t>
+      </w:r>
+      <w:r>
+        <w:rPr>
+          <w:b w:val="false"/>
+          <w:bCs w:val="false"/>
+          <w:i w:val="false"/>
+          <w:iCs w:val="false"/>
+        </w:rPr>
+        <w:t xml:space="preserve"> Cir. 1973)). </w:t>
+      </w:r>
+    </w:p>
+    <w:p>
+      <w:pPr>
+        <w:pStyle w:val="Normal"/>
+        <w:bidi w:val="0"/>
+        <w:jc w:val="left"/>
+        <w:rPr>
+          <w:b w:val="false"/>
+          <w:b w:val="false"/>
+          <w:bCs w:val="false"/>
+        </w:rPr>
+      </w:pPr>
+      <w:r>
+        <w:rPr>
+          <w:b w:val="false"/>
+          <w:bCs w:val="false"/>
+          <w:i w:val="false"/>
+          <w:iCs w:val="false"/>
+        </w:rPr>
+        <w:tab/>
+        <w:t xml:space="preserve">Fox’s Tennessee domicile is not contestable. He moved to Tennessee in 2019 to attend the University of Tennessee, he then relocated to Nashville after graduating in 2023. He leased an apartment in Nashville, obtained a Tennessee driver’s license, registered his vehicle in Tennessee, and registered to vote in Davidson county. Under </w:t>
+      </w:r>
+      <w:r>
+        <w:rPr>
+          <w:b w:val="false"/>
+          <w:bCs w:val="false"/>
+          <w:i/>
+          <w:iCs/>
+        </w:rPr>
+        <w:t>Von Dunser</w:t>
+      </w:r>
+      <w:r>
+        <w:rPr>
+          <w:b w:val="false"/>
+          <w:bCs w:val="false"/>
+          <w:i w:val="false"/>
+          <w:iCs w:val="false"/>
+        </w:rPr>
+        <w:t>, Fox’s Tennessee domicile continues unless the defendant proves a Kentucky domicile replace</w:t>
+      </w:r>
+      <w:r>
+        <w:rPr>
+          <w:b w:val="false"/>
+          <w:bCs w:val="false"/>
+          <w:i w:val="false"/>
+          <w:iCs w:val="false"/>
+        </w:rPr>
+        <w:t>d</w:t>
+      </w:r>
+      <w:r>
+        <w:rPr>
+          <w:b w:val="false"/>
+          <w:bCs w:val="false"/>
+          <w:i w:val="false"/>
+          <w:iCs w:val="false"/>
+        </w:rPr>
+        <w:t xml:space="preserve"> it. </w:t>
+      </w:r>
+    </w:p>
+    <w:p>
+      <w:pPr>
+        <w:pStyle w:val="Normal"/>
+        <w:bidi w:val="0"/>
+        <w:jc w:val="left"/>
+        <w:rPr>
+          <w:b w:val="false"/>
+          <w:b w:val="false"/>
+          <w:bCs w:val="false"/>
+        </w:rPr>
+      </w:pPr>
+      <w:r>
+        <w:rPr/>
+      </w:r>
+    </w:p>
+    <w:p>
+      <w:pPr>
+        <w:pStyle w:val="Normal"/>
+        <w:bidi w:val="0"/>
+        <w:jc w:val="left"/>
+        <w:rPr>
+          <w:b w:val="false"/>
+          <w:b w:val="false"/>
+          <w:bCs w:val="false"/>
+        </w:rPr>
+      </w:pPr>
+      <w:r>
+        <w:rPr>
+          <w:b w:val="false"/>
+          <w:bCs w:val="false"/>
+          <w:i w:val="false"/>
+          <w:iCs w:val="false"/>
+        </w:rPr>
+        <w:tab/>
+      </w:r>
+      <w:r>
+        <w:rPr>
+          <w:b w:val="false"/>
+          <w:bCs w:val="false"/>
+          <w:i w:val="false"/>
+          <w:iCs w:val="false"/>
+        </w:rPr>
+        <w:t>B. Fox’s physical presence remains predominantly in Tennessee and the Sixth Circuit has</w:t>
+        <w:tab/>
+        <w:t>treated presence at the original domicile as evidence of a party’s continued domicile there</w:t>
+      </w:r>
+    </w:p>
+    <w:p>
+      <w:pPr>
+        <w:pStyle w:val="Normal"/>
+        <w:bidi w:val="0"/>
+        <w:jc w:val="left"/>
+        <w:rPr>
+          <w:b w:val="false"/>
+          <w:b w:val="false"/>
+          <w:bCs w:val="false"/>
+        </w:rPr>
+      </w:pPr>
+      <w:r>
+        <w:rPr>
+          <w:b w:val="false"/>
+          <w:bCs w:val="false"/>
+          <w:i w:val="false"/>
+          <w:iCs w:val="false"/>
+        </w:rPr>
+        <w:tab/>
+      </w:r>
+    </w:p>
+    <w:p>
+      <w:pPr>
+        <w:pStyle w:val="Normal"/>
+        <w:bidi w:val="0"/>
+        <w:jc w:val="left"/>
+        <w:rPr>
+          <w:b w:val="false"/>
+          <w:b w:val="false"/>
+          <w:bCs w:val="false"/>
+        </w:rPr>
+      </w:pPr>
+      <w:r>
+        <w:rPr>
+          <w:b w:val="false"/>
+          <w:bCs w:val="false"/>
+          <w:i w:val="false"/>
+          <w:iCs w:val="false"/>
+        </w:rPr>
+        <w:tab/>
+      </w:r>
+      <w:r>
+        <w:rPr>
+          <w:b w:val="false"/>
+          <w:bCs w:val="false"/>
+          <w:i w:val="false"/>
+          <w:iCs w:val="false"/>
+        </w:rPr>
+        <w:t xml:space="preserve">Pitt Excavating presents a case where Mr. Pitt sought to prove he was domiciled in Tennessee. Mr. Pitt began to stay at an apartment in Madison, Tennessee in November 2012 </w:t>
+      </w:r>
+      <w:r>
+        <w:rPr>
+          <w:b w:val="false"/>
+          <w:bCs w:val="false"/>
+          <w:i w:val="false"/>
+          <w:iCs w:val="false"/>
+        </w:rPr>
+        <w:t>but did not begin to stay there exclusively until</w:t>
+      </w:r>
+      <w:r>
+        <w:rPr>
+          <w:b w:val="false"/>
+          <w:bCs w:val="false"/>
+          <w:i w:val="false"/>
+          <w:iCs w:val="false"/>
+        </w:rPr>
+        <w:t xml:space="preserve"> after eviction proceedings began in July 2013. However the court found Pitt’s behavior was “highly probative of a continuing desire to remain domiciled at the Kentucky farm” because he would still spend two to three nights per week at the farm </w:t>
+      </w:r>
+      <w:r>
+        <w:rPr>
+          <w:b w:val="false"/>
+          <w:bCs w:val="false"/>
+          <w:i w:val="false"/>
+          <w:iCs w:val="false"/>
+        </w:rPr>
+        <w:t>up until September 2013</w:t>
+      </w:r>
+      <w:r>
+        <w:rPr>
+          <w:b w:val="false"/>
+          <w:bCs w:val="false"/>
+          <w:i w:val="false"/>
+          <w:iCs w:val="false"/>
+        </w:rPr>
+        <w:t xml:space="preserve">. </w:t>
+      </w:r>
+      <w:r>
+        <w:rPr>
+          <w:b w:val="false"/>
+          <w:bCs w:val="false"/>
+          <w:i w:val="false"/>
+          <w:iCs w:val="false"/>
+        </w:rPr>
+        <w:t xml:space="preserve">The court concluded that spending four to five nights per week in Tennessee </w:t>
+      </w:r>
+      <w:r>
+        <w:rPr>
+          <w:b w:val="false"/>
+          <w:bCs w:val="false"/>
+          <w:i w:val="false"/>
+          <w:iCs w:val="false"/>
+        </w:rPr>
+        <w:t xml:space="preserve">in the weeks leading up to the case not sufficient to demonstrate that he abandoned his Kentucky domicile. </w:t>
+      </w:r>
+    </w:p>
+    <w:p>
+      <w:pPr>
+        <w:pStyle w:val="Normal"/>
+        <w:bidi w:val="0"/>
+        <w:jc w:val="left"/>
+        <w:rPr>
+          <w:b w:val="false"/>
+          <w:b w:val="false"/>
+          <w:bCs w:val="false"/>
+        </w:rPr>
+      </w:pPr>
+      <w:r>
+        <w:rPr>
+          <w:b w:val="false"/>
+          <w:bCs w:val="false"/>
+          <w:i w:val="false"/>
+          <w:iCs w:val="false"/>
+        </w:rPr>
+        <w:tab/>
+        <w:t xml:space="preserve">Fox’s claim is stronger than Mr. Pitt, he spends only one to two nights a week in Bowling Green and the remaining five or six days in Nashville. If residing two to three nights per week in the original domicile in the </w:t>
+      </w:r>
+      <w:r>
+        <w:rPr>
+          <w:b w:val="false"/>
+          <w:bCs w:val="false"/>
+          <w:i/>
+          <w:iCs/>
+        </w:rPr>
+        <w:t xml:space="preserve">Pitt </w:t>
+      </w:r>
+      <w:r>
+        <w:rPr>
+          <w:b w:val="false"/>
+          <w:bCs w:val="false"/>
+          <w:i w:val="false"/>
+          <w:iCs w:val="false"/>
+        </w:rPr>
+        <w:t xml:space="preserve">case was evidence of a continued domicile in Kentucky then Fox spending most nights in Tennessee would be strong evidence of Tennessee domicile. </w:t>
+      </w:r>
+    </w:p>
+    <w:p>
+      <w:pPr>
+        <w:pStyle w:val="Normal"/>
+        <w:bidi w:val="0"/>
+        <w:jc w:val="left"/>
+        <w:rPr>
+          <w:b w:val="false"/>
+          <w:b w:val="false"/>
+          <w:bCs w:val="false"/>
+        </w:rPr>
+      </w:pPr>
+      <w:r>
+        <w:rPr>
+          <w:b w:val="false"/>
+          <w:bCs w:val="false"/>
+          <w:i w:val="false"/>
+          <w:iCs w:val="false"/>
+        </w:rPr>
+        <w:tab/>
+        <w:t xml:space="preserve">Deasy reinforces this point </w:t>
+      </w:r>
+      <w:r>
+        <w:rPr>
+          <w:b w:val="false"/>
+          <w:bCs w:val="false"/>
+          <w:i w:val="false"/>
+          <w:iCs w:val="false"/>
+        </w:rPr>
+        <w:t xml:space="preserve">because the plaintiff claimed Tennessee domicile but he was physically present in Tennessee only on weekends while the home he owned was in Kentucky, 47 F. Appx 728. Ultimately the court determined that Deasy was a Kentucky domiciliary. The pattern of living for Fox is the opposite, he spends weekdays in Nashville and the weekends and holidays in Bowling Green. </w:t>
+      </w:r>
+    </w:p>
+    <w:p>
+      <w:pPr>
+        <w:pStyle w:val="Normal"/>
+        <w:bidi w:val="0"/>
+        <w:jc w:val="left"/>
+        <w:rPr>
+          <w:b w:val="false"/>
+          <w:b w:val="false"/>
+          <w:bCs w:val="false"/>
+        </w:rPr>
+      </w:pPr>
+      <w:r>
+        <w:rPr/>
+      </w:r>
+    </w:p>
+    <w:p>
+      <w:pPr>
+        <w:pStyle w:val="Normal"/>
+        <w:bidi w:val="0"/>
+        <w:jc w:val="left"/>
+        <w:rPr>
+          <w:b w:val="false"/>
+          <w:b w:val="false"/>
+          <w:bCs w:val="false"/>
+        </w:rPr>
+      </w:pPr>
+      <w:r>
+        <w:rPr>
+          <w:b w:val="false"/>
+          <w:bCs w:val="false"/>
+          <w:i w:val="false"/>
+          <w:iCs w:val="false"/>
+        </w:rPr>
+        <w:tab/>
+        <w:t xml:space="preserve">C. </w:t>
+      </w:r>
+      <w:r>
+        <w:rPr>
+          <w:b w:val="false"/>
+          <w:bCs w:val="false"/>
+          <w:i w:val="false"/>
+          <w:iCs w:val="false"/>
+        </w:rPr>
+        <w:t>The defendant’s evidence establishes a second residence, not a change of domiciled</w:t>
+      </w:r>
+    </w:p>
+    <w:p>
+      <w:pPr>
+        <w:pStyle w:val="Normal"/>
+        <w:bidi w:val="0"/>
+        <w:jc w:val="left"/>
+        <w:rPr>
+          <w:b w:val="false"/>
+          <w:b w:val="false"/>
+          <w:bCs w:val="false"/>
+        </w:rPr>
+      </w:pPr>
+      <w:r>
+        <w:rPr/>
+      </w:r>
+    </w:p>
+    <w:p>
+      <w:pPr>
+        <w:pStyle w:val="Normal"/>
+        <w:bidi w:val="0"/>
+        <w:jc w:val="left"/>
+        <w:rPr>
+          <w:b w:val="false"/>
+          <w:b w:val="false"/>
+          <w:bCs w:val="false"/>
+        </w:rPr>
+      </w:pPr>
+      <w:r>
+        <w:rPr>
+          <w:b w:val="false"/>
+          <w:bCs w:val="false"/>
+          <w:i w:val="false"/>
+          <w:iCs w:val="false"/>
+        </w:rPr>
+        <w:tab/>
+        <w:t xml:space="preserve">The defendant’s argument that Fox is a Kentucky resident relies on Fox’s ownership of his Bowling Green property, however, ownership of property is not domicile. In Deasy, the plaintiff owned a house and a duplex in Tennessee, however this fact was not sufficient to establish Tennessee domicile because he rented the house to someone else and trips to Tennessee were infrequent. 47 F. Appx 728. In </w:t>
+      </w:r>
+      <w:r>
+        <w:rPr>
+          <w:b w:val="false"/>
+          <w:bCs w:val="false"/>
+          <w:i/>
+          <w:iCs/>
+        </w:rPr>
+        <w:t>Pitt Excavating</w:t>
+      </w:r>
+      <w:r>
+        <w:rPr>
+          <w:b w:val="false"/>
+          <w:bCs w:val="false"/>
+          <w:i w:val="false"/>
+          <w:iCs w:val="false"/>
+        </w:rPr>
+        <w:t xml:space="preserve">, Mr. Pitt was determined to be a Kentucky resident even though he did not even own the property on which he resided. </w:t>
+      </w:r>
+      <w:r>
+        <w:rPr>
+          <w:b w:val="false"/>
+          <w:bCs w:val="false"/>
+          <w:i/>
+          <w:iCs/>
+        </w:rPr>
+        <w:t>Pitt Excavating</w:t>
+      </w:r>
+      <w:r>
+        <w:rPr>
+          <w:b w:val="false"/>
+          <w:bCs w:val="false"/>
+          <w:i w:val="false"/>
+          <w:iCs w:val="false"/>
+        </w:rPr>
+        <w:t xml:space="preserve">, 603 F. Appx 394-97. </w:t>
+      </w:r>
+      <w:r>
+        <w:rPr>
+          <w:b w:val="false"/>
+          <w:bCs w:val="false"/>
+          <w:i w:val="false"/>
+          <w:iCs w:val="false"/>
+        </w:rPr>
+        <w:t xml:space="preserve">These cases both apply  the principle established in </w:t>
+      </w:r>
+      <w:r>
+        <w:rPr>
+          <w:b w:val="false"/>
+          <w:bCs w:val="false"/>
+          <w:i/>
+          <w:iCs/>
+        </w:rPr>
+        <w:t>Stifel</w:t>
+      </w:r>
+      <w:r>
+        <w:rPr>
+          <w:b w:val="false"/>
+          <w:bCs w:val="false"/>
+          <w:i w:val="false"/>
+          <w:iCs w:val="false"/>
+        </w:rPr>
+        <w:t xml:space="preserve"> which is that proving citizenship requires showing domicile not just residence. Fox uses the Bowling Green residence only on the weekends and holidays, it only furnished minimally and has only been connected to utilities for a few months. This does not reflect a house that is being occupied as a primary residence.</w:t>
+      </w:r>
+    </w:p>
+    <w:p>
+      <w:pPr>
+        <w:pStyle w:val="Normal"/>
+        <w:bidi w:val="0"/>
+        <w:jc w:val="left"/>
+        <w:rPr>
+          <w:b w:val="false"/>
+          <w:b w:val="false"/>
+          <w:bCs w:val="false"/>
+        </w:rPr>
+      </w:pPr>
+      <w:r>
+        <w:rPr>
+          <w:b w:val="false"/>
+          <w:bCs w:val="false"/>
+          <w:i w:val="false"/>
+          <w:iCs w:val="false"/>
+        </w:rPr>
+        <w:tab/>
+        <w:t xml:space="preserve">Since Fox’s residence in Kentucky has been brief, this strengthens his argument as a Tennessee citizen. Courts “consistently reject short-term, transient abnormalities as citizenship markers.” </w:t>
+      </w:r>
+      <w:r>
+        <w:rPr>
+          <w:b w:val="false"/>
+          <w:bCs w:val="false"/>
+          <w:i/>
+          <w:iCs/>
+        </w:rPr>
+        <w:t>Robinette</w:t>
+      </w:r>
+      <w:r>
+        <w:rPr>
+          <w:b w:val="false"/>
+          <w:bCs w:val="false"/>
+          <w:i w:val="false"/>
+          <w:iCs w:val="false"/>
+        </w:rPr>
+        <w:t xml:space="preserve">, 2019 WL 13212618, at *2. In </w:t>
+      </w:r>
+      <w:r>
+        <w:rPr>
+          <w:b w:val="false"/>
+          <w:bCs w:val="false"/>
+          <w:i/>
+          <w:iCs/>
+        </w:rPr>
+        <w:t>Robinette</w:t>
+      </w:r>
+      <w:r>
+        <w:rPr>
+          <w:b w:val="false"/>
+          <w:bCs w:val="false"/>
+          <w:i w:val="false"/>
+          <w:iCs w:val="false"/>
+        </w:rPr>
+        <w:t xml:space="preserve">, the plaintiff’s six month address </w:t>
+      </w:r>
+      <w:r>
+        <w:rPr>
+          <w:b w:val="false"/>
+          <w:bCs w:val="false"/>
+          <w:i w:val="false"/>
+          <w:iCs w:val="false"/>
+        </w:rPr>
+        <w:t>in Kentucky did not override a thirteen year pattern of residence in Michigan. Fox’s Kentucky house has been finished for only six months, while he has a pattern of residence in Tennessee since 2019.</w:t>
+      </w:r>
+    </w:p>
+    <w:p>
+      <w:pPr>
+        <w:pStyle w:val="Normal"/>
+        <w:bidi w:val="0"/>
+        <w:jc w:val="left"/>
+        <w:rPr>
+          <w:b w:val="false"/>
+          <w:b w:val="false"/>
+          <w:bCs w:val="false"/>
+        </w:rPr>
+      </w:pPr>
+      <w:r>
+        <w:rPr>
+          <w:b w:val="false"/>
+          <w:bCs w:val="false"/>
+          <w:i w:val="false"/>
+          <w:iCs w:val="false"/>
+        </w:rPr>
+        <w:tab/>
+      </w:r>
+      <w:r>
+        <w:rPr>
+          <w:b w:val="false"/>
+          <w:bCs w:val="false"/>
+          <w:i w:val="false"/>
+          <w:iCs w:val="false"/>
+        </w:rPr>
+        <w:t xml:space="preserve">Fox changed his Facebook profile to say that he lives in Kentucky when the house there was completed. This is addressed by </w:t>
+      </w:r>
+      <w:r>
+        <w:rPr>
+          <w:b w:val="false"/>
+          <w:bCs w:val="false"/>
+          <w:i/>
+          <w:iCs/>
+        </w:rPr>
+        <w:t>Robinette</w:t>
+      </w:r>
+      <w:r>
+        <w:rPr>
+          <w:b w:val="false"/>
+          <w:bCs w:val="false"/>
+          <w:i w:val="false"/>
+          <w:iCs w:val="false"/>
+        </w:rPr>
+        <w:t xml:space="preserve">, where the court considered a print-out of Emmon’s Facebook profile saying that she currently lives in Kentucky and is from Michigan, </w:t>
+      </w:r>
+      <w:r>
+        <w:rPr>
+          <w:b w:val="false"/>
+          <w:bCs w:val="false"/>
+          <w:i w:val="false"/>
+          <w:iCs w:val="false"/>
+        </w:rPr>
+        <w:t xml:space="preserve">this however, was not strong enough evidence to indicate that Emmons was a Kentucky citizen. Thus Fox’s social media profile is not sufficient to establish him as a Kentucky resident especially when other factors such as voter registration, vehicle registration and living patterns point to his status as a Tennessee citizen. </w:t>
+      </w:r>
+    </w:p>
+    <w:p>
+      <w:pPr>
+        <w:pStyle w:val="Normal"/>
+        <w:bidi w:val="0"/>
+        <w:jc w:val="left"/>
+        <w:rPr>
+          <w:b w:val="false"/>
+          <w:b w:val="false"/>
+          <w:bCs w:val="false"/>
+        </w:rPr>
+      </w:pPr>
+      <w:r>
+        <w:rPr>
+          <w:b w:val="false"/>
+          <w:bCs w:val="false"/>
+          <w:i w:val="false"/>
+          <w:iCs w:val="false"/>
+        </w:rPr>
+        <w:tab/>
+        <w:t xml:space="preserve">The promotional flyer for one of Fox’s shows is not sufficient evidence of Kentucky citizenship either. Fox holds that he did not create nor approve it the flyer </w:t>
+      </w:r>
+      <w:r>
+        <w:rPr>
+          <w:b w:val="false"/>
+          <w:bCs w:val="false"/>
+          <w:i w:val="false"/>
+          <w:iCs w:val="false"/>
+        </w:rPr>
+        <w:t>which is</w:t>
+      </w:r>
+      <w:r>
+        <w:rPr>
+          <w:b w:val="false"/>
+          <w:bCs w:val="false"/>
+          <w:i w:val="false"/>
+          <w:iCs w:val="false"/>
+        </w:rPr>
+        <w:t xml:space="preserve"> credited to CSP Marketing. </w:t>
+      </w:r>
+      <w:r>
+        <w:rPr>
+          <w:b w:val="false"/>
+          <w:bCs w:val="false"/>
+          <w:i/>
+          <w:iCs/>
+        </w:rPr>
+        <w:t>Stifel</w:t>
+      </w:r>
+      <w:r>
+        <w:rPr>
+          <w:b w:val="false"/>
+          <w:bCs w:val="false"/>
+          <w:i w:val="false"/>
+          <w:iCs w:val="false"/>
+        </w:rPr>
+        <w:t xml:space="preserve"> establishes that intent to domicile in a different state can be expressed through actions the party undertakes himself such as affidavits, registrations, opening bank accounts, etc. Since the flyer was created by a third party, this is weak evidence. </w:t>
+      </w:r>
+    </w:p>
+    <w:p>
+      <w:pPr>
+        <w:pStyle w:val="Normal"/>
+        <w:bidi w:val="0"/>
+        <w:jc w:val="left"/>
+        <w:rPr>
+          <w:b w:val="false"/>
+          <w:b w:val="false"/>
+          <w:bCs w:val="false"/>
+        </w:rPr>
+      </w:pPr>
+      <w:r>
+        <w:rPr/>
+      </w:r>
+    </w:p>
+    <w:p>
+      <w:pPr>
+        <w:pStyle w:val="Normal"/>
+        <w:bidi w:val="0"/>
+        <w:jc w:val="left"/>
+        <w:rPr>
+          <w:b w:val="false"/>
+          <w:b w:val="false"/>
+          <w:bCs w:val="false"/>
+        </w:rPr>
+      </w:pPr>
+      <w:r>
+        <w:rPr>
+          <w:b w:val="false"/>
+          <w:bCs w:val="false"/>
+          <w:i w:val="false"/>
+          <w:iCs w:val="false"/>
+        </w:rPr>
+        <w:tab/>
+        <w:t xml:space="preserve">D. Fox’s deisre to settle in Bowling Green after marrying is contingent on future plans which </w:t>
+        <w:tab/>
+        <w:t>have not occurred yet and do not effect a change of domicile</w:t>
+      </w:r>
+    </w:p>
+    <w:p>
+      <w:pPr>
+        <w:pStyle w:val="Normal"/>
+        <w:bidi w:val="0"/>
+        <w:jc w:val="left"/>
+        <w:rPr>
+          <w:b w:val="false"/>
+          <w:b w:val="false"/>
+          <w:bCs w:val="false"/>
+        </w:rPr>
+      </w:pPr>
+      <w:r>
+        <w:rPr/>
+      </w:r>
+    </w:p>
+    <w:p>
+      <w:pPr>
+        <w:pStyle w:val="Normal"/>
+        <w:bidi w:val="0"/>
+        <w:jc w:val="left"/>
+        <w:rPr>
+          <w:b w:val="false"/>
+          <w:b w:val="false"/>
+          <w:bCs w:val="false"/>
+        </w:rPr>
+      </w:pPr>
+      <w:r>
+        <w:rPr>
+          <w:b w:val="false"/>
+          <w:bCs w:val="false"/>
+          <w:i w:val="false"/>
+          <w:iCs w:val="false"/>
+        </w:rPr>
+        <w:tab/>
+        <w:t xml:space="preserve">The defendant’s strongest argument is that Fox hopes to settle in </w:t>
+      </w:r>
+      <w:r>
+        <w:rPr>
+          <w:b w:val="false"/>
+          <w:bCs w:val="false"/>
+          <w:i w:val="false"/>
+          <w:iCs w:val="false"/>
+        </w:rPr>
+        <w:t>Bowling Green when he marries his girlfriend. Citizenship reflects a person’s long term plan for state of habitation rather than just current residence. Robinette, 2019 WL 13212618, at *2 (citing Myrick v. Wellpoint, Inc., 764 F.3d 662, 664 (7</w:t>
+      </w:r>
+      <w:r>
+        <w:rPr>
+          <w:b w:val="false"/>
+          <w:bCs w:val="false"/>
+          <w:i w:val="false"/>
+          <w:iCs w:val="false"/>
+          <w:vertAlign w:val="superscript"/>
+        </w:rPr>
+        <w:t>th</w:t>
+      </w:r>
+      <w:r>
+        <w:rPr>
+          <w:b w:val="false"/>
+          <w:bCs w:val="false"/>
+          <w:i w:val="false"/>
+          <w:iCs w:val="false"/>
+        </w:rPr>
+        <w:t xml:space="preserve"> Cir. 2014)). The defendant will argue that this is evidence that Fox intends for his long term residence to be Kentucky. </w:t>
+      </w:r>
+    </w:p>
+    <w:p>
+      <w:pPr>
+        <w:pStyle w:val="Normal"/>
+        <w:bidi w:val="0"/>
+        <w:jc w:val="left"/>
+        <w:rPr>
+          <w:b w:val="false"/>
+          <w:b w:val="false"/>
+          <w:bCs w:val="false"/>
+        </w:rPr>
+      </w:pPr>
+      <w:r>
+        <w:rPr>
+          <w:b w:val="false"/>
+          <w:bCs w:val="false"/>
+          <w:i w:val="false"/>
+          <w:iCs w:val="false"/>
+        </w:rPr>
+        <w:tab/>
+        <w:t xml:space="preserve">This argument fails because domicile is fixed by the facts as they existed when the suit was initiated. </w:t>
+      </w:r>
+      <w:r>
+        <w:rPr>
+          <w:b w:val="false"/>
+          <w:bCs w:val="false"/>
+          <w:i w:val="false"/>
+          <w:iCs w:val="false"/>
+        </w:rPr>
+        <w:t>Pitt Excavating, 603 F. Appx 396 (citing Dunbar, 426 F.2d 174, 177 (6</w:t>
+      </w:r>
+      <w:r>
+        <w:rPr>
+          <w:b w:val="false"/>
+          <w:bCs w:val="false"/>
+          <w:i w:val="false"/>
+          <w:iCs w:val="false"/>
+          <w:vertAlign w:val="superscript"/>
+        </w:rPr>
+        <w:t>th</w:t>
+      </w:r>
+      <w:r>
+        <w:rPr>
+          <w:b w:val="false"/>
+          <w:bCs w:val="false"/>
+          <w:i w:val="false"/>
+          <w:iCs w:val="false"/>
+        </w:rPr>
+        <w:t xml:space="preserve"> Cir. 1970)). As of July 2026, Fox had not proposed, was not engaged, and was not married. An intention to relocate to another state at an unspecified time in the future is not an intention to establish domicile nor does it indicate the absence of an intention to make a home elsewhere. </w:t>
+      </w:r>
+    </w:p>
+    <w:p>
+      <w:pPr>
+        <w:pStyle w:val="Normal"/>
+        <w:bidi w:val="0"/>
+        <w:jc w:val="left"/>
+        <w:rPr>
+          <w:b w:val="false"/>
+          <w:b w:val="false"/>
+          <w:bCs w:val="false"/>
+        </w:rPr>
+      </w:pPr>
+      <w:r>
+        <w:rPr>
+          <w:b w:val="false"/>
+          <w:bCs w:val="false"/>
+          <w:i w:val="false"/>
+          <w:iCs w:val="false"/>
+        </w:rPr>
+        <w:tab/>
+      </w:r>
+      <w:r>
+        <w:rPr>
+          <w:b w:val="false"/>
+          <w:bCs w:val="false"/>
+          <w:i w:val="false"/>
+          <w:iCs w:val="false"/>
+        </w:rPr>
+        <w:t xml:space="preserve">Fox did not indicate that he intended to abandon Tennessee citizenship because he said he plans to live in Nashville for at least the next few years because Nashville is where his regular gigs are played and where his income comes from. He added that even after any potential move to Kentucky, he would still commute to Nashville for work. Because Fox expects to continue earning income in Tennessee indefinitely and states that he will continue living there for the coming years, he has not formed a present intention to make Kentucky his home indefinitely. </w:t>
+      </w:r>
+    </w:p>
+    <w:p>
+      <w:pPr>
+        <w:pStyle w:val="Normal"/>
+        <w:bidi w:val="0"/>
+        <w:jc w:val="left"/>
+        <w:rPr>
+          <w:b w:val="false"/>
+          <w:b w:val="false"/>
+          <w:bCs w:val="false"/>
+        </w:rPr>
+      </w:pPr>
+      <w:r>
+        <w:rPr>
+          <w:b w:val="false"/>
+          <w:bCs w:val="false"/>
+          <w:i w:val="false"/>
+          <w:iCs w:val="false"/>
+        </w:rPr>
+        <w:tab/>
+      </w:r>
+    </w:p>
+    <w:p>
+      <w:pPr>
+        <w:pStyle w:val="Normal"/>
+        <w:bidi w:val="0"/>
+        <w:jc w:val="left"/>
+        <w:rPr>
+          <w:b w:val="false"/>
+          <w:b w:val="false"/>
+          <w:bCs w:val="false"/>
+        </w:rPr>
+      </w:pPr>
+      <w:r>
+        <w:rPr>
+          <w:b w:val="false"/>
+          <w:bCs w:val="false"/>
+          <w:i w:val="false"/>
+          <w:iCs w:val="false"/>
+        </w:rPr>
+        <w:tab/>
+        <w:t>E. Conclusion</w:t>
+      </w:r>
+    </w:p>
+    <w:p>
+      <w:pPr>
+        <w:pStyle w:val="Normal"/>
+        <w:bidi w:val="0"/>
+        <w:jc w:val="left"/>
+        <w:rPr>
+          <w:b w:val="false"/>
+          <w:b w:val="false"/>
+          <w:bCs w:val="false"/>
+        </w:rPr>
+      </w:pPr>
+      <w:r>
+        <w:rPr/>
+      </w:r>
+    </w:p>
+    <w:p>
+      <w:pPr>
+        <w:pStyle w:val="Normal"/>
+        <w:bidi w:val="0"/>
+        <w:jc w:val="left"/>
+        <w:rPr>
+          <w:b w:val="false"/>
+          <w:b w:val="false"/>
+          <w:bCs w:val="false"/>
+        </w:rPr>
+      </w:pPr>
+      <w:r>
+        <w:rPr>
+          <w:b w:val="false"/>
+          <w:bCs w:val="false"/>
+          <w:i w:val="false"/>
+          <w:iCs w:val="false"/>
+        </w:rPr>
+        <w:tab/>
+        <w:t xml:space="preserve">The defendant cannot carry the burden of proving that Fox is a Kentucky citizen. Fox’s physical presence is predominately in Tennessee and exceeds the presence that Pitt had at his original domicile in Kentucky in </w:t>
+      </w:r>
+      <w:r>
+        <w:rPr>
+          <w:b w:val="false"/>
+          <w:bCs w:val="false"/>
+          <w:i/>
+          <w:iCs/>
+        </w:rPr>
+        <w:t>Pitt Excavating</w:t>
+      </w:r>
+      <w:r>
+        <w:rPr>
+          <w:b w:val="false"/>
+          <w:bCs w:val="false"/>
+          <w:i w:val="false"/>
+          <w:iCs w:val="false"/>
+        </w:rPr>
+        <w:t xml:space="preserve">. </w:t>
+      </w:r>
+      <w:r>
+        <w:rPr>
+          <w:b w:val="false"/>
+          <w:bCs w:val="false"/>
+          <w:i w:val="false"/>
+          <w:iCs w:val="false"/>
+        </w:rPr>
+        <w:t xml:space="preserve">The objective signs of intent that the Sixth Circuit relied on in </w:t>
+      </w:r>
+      <w:r>
+        <w:rPr>
+          <w:b w:val="false"/>
+          <w:bCs w:val="false"/>
+          <w:i/>
+          <w:iCs/>
+        </w:rPr>
+        <w:t>Deasy</w:t>
+      </w:r>
+      <w:r>
+        <w:rPr>
+          <w:b w:val="false"/>
+          <w:bCs w:val="false"/>
+          <w:i w:val="false"/>
+          <w:iCs w:val="false"/>
+        </w:rPr>
+        <w:t xml:space="preserve"> and </w:t>
+      </w:r>
+      <w:r>
+        <w:rPr>
+          <w:b w:val="false"/>
+          <w:bCs w:val="false"/>
+          <w:i/>
+          <w:iCs/>
+        </w:rPr>
+        <w:t>Pitt Excavating</w:t>
+      </w:r>
+      <w:r>
+        <w:rPr>
+          <w:b w:val="false"/>
+          <w:bCs w:val="false"/>
+          <w:i w:val="false"/>
+          <w:iCs w:val="false"/>
+        </w:rPr>
+        <w:t xml:space="preserve"> point to Tennessee in Fox’s case. </w:t>
+      </w:r>
+      <w:r>
+        <w:rPr>
+          <w:b w:val="false"/>
+          <w:bCs w:val="false"/>
+          <w:i/>
+          <w:iCs/>
+        </w:rPr>
+        <w:t>Deasy</w:t>
+      </w:r>
+      <w:r>
+        <w:rPr>
+          <w:b w:val="false"/>
+          <w:bCs w:val="false"/>
+          <w:i w:val="false"/>
+          <w:iCs w:val="false"/>
+        </w:rPr>
+        <w:t xml:space="preserve"> found insufficient evidence inconsistent with a Kentucky domicile. 47 F. Appx 728. Fox presents stronger evidence indicating evidence against a Kentucky domicile he has a Nashville lease, an active Tennessee voter registration, a Tennessee license, a Tennessee vehicle registration, and a music career based in Nashville. </w:t>
+      </w:r>
+      <w:r>
+        <w:rPr>
+          <w:b w:val="false"/>
+          <w:bCs w:val="false"/>
+          <w:i w:val="false"/>
+          <w:iCs w:val="false"/>
+        </w:rPr>
+        <w:t xml:space="preserve">The defendant’s case for Fox being a Kentucky citizen rests upon his recently finished Bowling Green house, his social media profile, and a promoter’s flyer advertising his show. A court will likely find that Fox remains a citizen of Tennessee when the suit was initiated and that complete diversity is absent.  </w:t>
       </w:r>
     </w:p>
     <w:sectPr>
@@ -6321,5 +7700,27 @@
     </w:pPr>
     <w:rPr/>
   </w:style>
+  <w:style w:type="paragraph" w:styleId="HeaderandFooter">
+    <w:name w:val="Header and Footer"/>
+    <w:basedOn w:val="Normal"/>
+    <w:qFormat/>
+    <w:pPr>
+      <w:suppressLineNumbers/>
+      <w:tabs>
+        <w:tab w:val="clear" w:pos="709"/>
+        <w:tab w:val="center" w:pos="4986" w:leader="none"/>
+        <w:tab w:val="right" w:pos="9972" w:leader="none"/>
+      </w:tabs>
+    </w:pPr>
+    <w:rPr/>
+  </w:style>
+  <w:style w:type="paragraph" w:styleId="Footer">
+    <w:name w:val="Footer"/>
+    <w:basedOn w:val="HeaderandFooter"/>
+    <w:pPr>
+      <w:suppressLineNumbers/>
+    </w:pPr>
+    <w:rPr/>
+  </w:style>
 </w:styles>
 </file>
</xml_diff>

<commit_message>
Tab function in Note box
</commit_message>
<xml_diff>
--- a/notes/lawyering_skills_and_strategies/Memo.docx
+++ b/notes/lawyering_skills_and_strategies/Memo.docx
@@ -1745,10 +1745,10 @@
       </w:tblPr>
       <w:tblGrid>
         <w:gridCol w:w="1994"/>
-        <w:gridCol w:w="1991"/>
-        <w:gridCol w:w="1998"/>
-        <w:gridCol w:w="1991"/>
-        <w:gridCol w:w="1998"/>
+        <w:gridCol w:w="1990"/>
+        <w:gridCol w:w="1999"/>
+        <w:gridCol w:w="1990"/>
+        <w:gridCol w:w="1999"/>
       </w:tblGrid>
       <w:tr>
         <w:trPr/>
@@ -1774,7 +1774,7 @@
         </w:tc>
         <w:tc>
           <w:tcPr>
-            <w:tcW w:w="1991" w:type="dxa"/>
+            <w:tcW w:w="1990" w:type="dxa"/>
             <w:tcBorders>
               <w:top w:val="single" w:sz="4" w:space="0" w:color="000000"/>
               <w:left w:val="single" w:sz="4" w:space="0" w:color="000000"/>
@@ -1795,7 +1795,7 @@
         </w:tc>
         <w:tc>
           <w:tcPr>
-            <w:tcW w:w="1998" w:type="dxa"/>
+            <w:tcW w:w="1999" w:type="dxa"/>
             <w:tcBorders>
               <w:top w:val="single" w:sz="4" w:space="0" w:color="000000"/>
               <w:left w:val="single" w:sz="4" w:space="0" w:color="000000"/>
@@ -1816,7 +1816,7 @@
         </w:tc>
         <w:tc>
           <w:tcPr>
-            <w:tcW w:w="1991" w:type="dxa"/>
+            <w:tcW w:w="1990" w:type="dxa"/>
             <w:tcBorders>
               <w:top w:val="single" w:sz="4" w:space="0" w:color="000000"/>
               <w:left w:val="single" w:sz="4" w:space="0" w:color="000000"/>
@@ -1837,7 +1837,7 @@
         </w:tc>
         <w:tc>
           <w:tcPr>
-            <w:tcW w:w="1998" w:type="dxa"/>
+            <w:tcW w:w="1999" w:type="dxa"/>
             <w:tcBorders>
               <w:top w:val="single" w:sz="4" w:space="0" w:color="000000"/>
               <w:left w:val="single" w:sz="4" w:space="0" w:color="000000"/>
@@ -1882,7 +1882,7 @@
         </w:tc>
         <w:tc>
           <w:tcPr>
-            <w:tcW w:w="1991" w:type="dxa"/>
+            <w:tcW w:w="1990" w:type="dxa"/>
             <w:tcBorders>
               <w:left w:val="single" w:sz="4" w:space="0" w:color="000000"/>
               <w:bottom w:val="single" w:sz="4" w:space="0" w:color="000000"/>
@@ -1902,7 +1902,7 @@
         </w:tc>
         <w:tc>
           <w:tcPr>
-            <w:tcW w:w="1998" w:type="dxa"/>
+            <w:tcW w:w="1999" w:type="dxa"/>
             <w:tcBorders>
               <w:left w:val="single" w:sz="4" w:space="0" w:color="000000"/>
               <w:bottom w:val="single" w:sz="4" w:space="0" w:color="000000"/>
@@ -1922,7 +1922,7 @@
         </w:tc>
         <w:tc>
           <w:tcPr>
-            <w:tcW w:w="1991" w:type="dxa"/>
+            <w:tcW w:w="1990" w:type="dxa"/>
             <w:tcBorders>
               <w:left w:val="single" w:sz="4" w:space="0" w:color="000000"/>
               <w:bottom w:val="single" w:sz="4" w:space="0" w:color="000000"/>
@@ -1942,7 +1942,7 @@
         </w:tc>
         <w:tc>
           <w:tcPr>
-            <w:tcW w:w="1998" w:type="dxa"/>
+            <w:tcW w:w="1999" w:type="dxa"/>
             <w:tcBorders>
               <w:left w:val="single" w:sz="4" w:space="0" w:color="000000"/>
               <w:bottom w:val="single" w:sz="4" w:space="0" w:color="000000"/>
@@ -1986,7 +1986,7 @@
         </w:tc>
         <w:tc>
           <w:tcPr>
-            <w:tcW w:w="1991" w:type="dxa"/>
+            <w:tcW w:w="1990" w:type="dxa"/>
             <w:tcBorders>
               <w:left w:val="single" w:sz="4" w:space="0" w:color="000000"/>
               <w:bottom w:val="single" w:sz="4" w:space="0" w:color="000000"/>
@@ -2006,7 +2006,7 @@
         </w:tc>
         <w:tc>
           <w:tcPr>
-            <w:tcW w:w="1998" w:type="dxa"/>
+            <w:tcW w:w="1999" w:type="dxa"/>
             <w:tcBorders>
               <w:left w:val="single" w:sz="4" w:space="0" w:color="000000"/>
               <w:bottom w:val="single" w:sz="4" w:space="0" w:color="000000"/>
@@ -2026,7 +2026,7 @@
         </w:tc>
         <w:tc>
           <w:tcPr>
-            <w:tcW w:w="1991" w:type="dxa"/>
+            <w:tcW w:w="1990" w:type="dxa"/>
             <w:tcBorders>
               <w:left w:val="single" w:sz="4" w:space="0" w:color="000000"/>
               <w:bottom w:val="single" w:sz="4" w:space="0" w:color="000000"/>
@@ -2046,7 +2046,7 @@
         </w:tc>
         <w:tc>
           <w:tcPr>
-            <w:tcW w:w="1998" w:type="dxa"/>
+            <w:tcW w:w="1999" w:type="dxa"/>
             <w:tcBorders>
               <w:left w:val="single" w:sz="4" w:space="0" w:color="000000"/>
               <w:bottom w:val="single" w:sz="4" w:space="0" w:color="000000"/>
@@ -2090,7 +2090,7 @@
         </w:tc>
         <w:tc>
           <w:tcPr>
-            <w:tcW w:w="1991" w:type="dxa"/>
+            <w:tcW w:w="1990" w:type="dxa"/>
             <w:tcBorders>
               <w:left w:val="single" w:sz="4" w:space="0" w:color="000000"/>
               <w:bottom w:val="single" w:sz="4" w:space="0" w:color="000000"/>
@@ -2110,7 +2110,7 @@
         </w:tc>
         <w:tc>
           <w:tcPr>
-            <w:tcW w:w="1998" w:type="dxa"/>
+            <w:tcW w:w="1999" w:type="dxa"/>
             <w:tcBorders>
               <w:left w:val="single" w:sz="4" w:space="0" w:color="000000"/>
               <w:bottom w:val="single" w:sz="4" w:space="0" w:color="000000"/>
@@ -2130,7 +2130,7 @@
         </w:tc>
         <w:tc>
           <w:tcPr>
-            <w:tcW w:w="1991" w:type="dxa"/>
+            <w:tcW w:w="1990" w:type="dxa"/>
             <w:tcBorders>
               <w:left w:val="single" w:sz="4" w:space="0" w:color="000000"/>
               <w:bottom w:val="single" w:sz="4" w:space="0" w:color="000000"/>
@@ -2150,7 +2150,7 @@
         </w:tc>
         <w:tc>
           <w:tcPr>
-            <w:tcW w:w="1998" w:type="dxa"/>
+            <w:tcW w:w="1999" w:type="dxa"/>
             <w:tcBorders>
               <w:left w:val="single" w:sz="4" w:space="0" w:color="000000"/>
               <w:bottom w:val="single" w:sz="4" w:space="0" w:color="000000"/>
@@ -2194,7 +2194,7 @@
         </w:tc>
         <w:tc>
           <w:tcPr>
-            <w:tcW w:w="1991" w:type="dxa"/>
+            <w:tcW w:w="1990" w:type="dxa"/>
             <w:tcBorders>
               <w:left w:val="single" w:sz="4" w:space="0" w:color="000000"/>
               <w:bottom w:val="single" w:sz="4" w:space="0" w:color="000000"/>
@@ -2214,7 +2214,7 @@
         </w:tc>
         <w:tc>
           <w:tcPr>
-            <w:tcW w:w="1998" w:type="dxa"/>
+            <w:tcW w:w="1999" w:type="dxa"/>
             <w:tcBorders>
               <w:left w:val="single" w:sz="4" w:space="0" w:color="000000"/>
               <w:bottom w:val="single" w:sz="4" w:space="0" w:color="000000"/>
@@ -2234,7 +2234,7 @@
         </w:tc>
         <w:tc>
           <w:tcPr>
-            <w:tcW w:w="1991" w:type="dxa"/>
+            <w:tcW w:w="1990" w:type="dxa"/>
             <w:tcBorders>
               <w:left w:val="single" w:sz="4" w:space="0" w:color="000000"/>
               <w:bottom w:val="single" w:sz="4" w:space="0" w:color="000000"/>
@@ -2254,7 +2254,7 @@
         </w:tc>
         <w:tc>
           <w:tcPr>
-            <w:tcW w:w="1998" w:type="dxa"/>
+            <w:tcW w:w="1999" w:type="dxa"/>
             <w:tcBorders>
               <w:left w:val="single" w:sz="4" w:space="0" w:color="000000"/>
               <w:bottom w:val="single" w:sz="4" w:space="0" w:color="000000"/>
@@ -2298,7 +2298,7 @@
         </w:tc>
         <w:tc>
           <w:tcPr>
-            <w:tcW w:w="1991" w:type="dxa"/>
+            <w:tcW w:w="1990" w:type="dxa"/>
             <w:tcBorders>
               <w:left w:val="single" w:sz="4" w:space="0" w:color="000000"/>
               <w:bottom w:val="single" w:sz="4" w:space="0" w:color="000000"/>
@@ -2318,7 +2318,7 @@
         </w:tc>
         <w:tc>
           <w:tcPr>
-            <w:tcW w:w="1998" w:type="dxa"/>
+            <w:tcW w:w="1999" w:type="dxa"/>
             <w:tcBorders>
               <w:left w:val="single" w:sz="4" w:space="0" w:color="000000"/>
               <w:bottom w:val="single" w:sz="4" w:space="0" w:color="000000"/>
@@ -2338,7 +2338,7 @@
         </w:tc>
         <w:tc>
           <w:tcPr>
-            <w:tcW w:w="1991" w:type="dxa"/>
+            <w:tcW w:w="1990" w:type="dxa"/>
             <w:tcBorders>
               <w:left w:val="single" w:sz="4" w:space="0" w:color="000000"/>
               <w:bottom w:val="single" w:sz="4" w:space="0" w:color="000000"/>
@@ -2358,7 +2358,7 @@
         </w:tc>
         <w:tc>
           <w:tcPr>
-            <w:tcW w:w="1998" w:type="dxa"/>
+            <w:tcW w:w="1999" w:type="dxa"/>
             <w:tcBorders>
               <w:left w:val="single" w:sz="4" w:space="0" w:color="000000"/>
               <w:bottom w:val="single" w:sz="4" w:space="0" w:color="000000"/>
@@ -2402,7 +2402,7 @@
         </w:tc>
         <w:tc>
           <w:tcPr>
-            <w:tcW w:w="1991" w:type="dxa"/>
+            <w:tcW w:w="1990" w:type="dxa"/>
             <w:tcBorders>
               <w:left w:val="single" w:sz="4" w:space="0" w:color="000000"/>
               <w:bottom w:val="single" w:sz="4" w:space="0" w:color="000000"/>
@@ -2422,7 +2422,7 @@
         </w:tc>
         <w:tc>
           <w:tcPr>
-            <w:tcW w:w="1998" w:type="dxa"/>
+            <w:tcW w:w="1999" w:type="dxa"/>
             <w:tcBorders>
               <w:left w:val="single" w:sz="4" w:space="0" w:color="000000"/>
               <w:bottom w:val="single" w:sz="4" w:space="0" w:color="000000"/>
@@ -2442,7 +2442,7 @@
         </w:tc>
         <w:tc>
           <w:tcPr>
-            <w:tcW w:w="1991" w:type="dxa"/>
+            <w:tcW w:w="1990" w:type="dxa"/>
             <w:tcBorders>
               <w:left w:val="single" w:sz="4" w:space="0" w:color="000000"/>
               <w:bottom w:val="single" w:sz="4" w:space="0" w:color="000000"/>
@@ -2462,7 +2462,7 @@
         </w:tc>
         <w:tc>
           <w:tcPr>
-            <w:tcW w:w="1998" w:type="dxa"/>
+            <w:tcW w:w="1999" w:type="dxa"/>
             <w:tcBorders>
               <w:left w:val="single" w:sz="4" w:space="0" w:color="000000"/>
               <w:bottom w:val="single" w:sz="4" w:space="0" w:color="000000"/>
@@ -2506,7 +2506,7 @@
         </w:tc>
         <w:tc>
           <w:tcPr>
-            <w:tcW w:w="1991" w:type="dxa"/>
+            <w:tcW w:w="1990" w:type="dxa"/>
             <w:tcBorders>
               <w:left w:val="single" w:sz="4" w:space="0" w:color="000000"/>
               <w:bottom w:val="single" w:sz="4" w:space="0" w:color="000000"/>
@@ -2526,7 +2526,7 @@
         </w:tc>
         <w:tc>
           <w:tcPr>
-            <w:tcW w:w="1998" w:type="dxa"/>
+            <w:tcW w:w="1999" w:type="dxa"/>
             <w:tcBorders>
               <w:left w:val="single" w:sz="4" w:space="0" w:color="000000"/>
               <w:bottom w:val="single" w:sz="4" w:space="0" w:color="000000"/>
@@ -2546,7 +2546,7 @@
         </w:tc>
         <w:tc>
           <w:tcPr>
-            <w:tcW w:w="1991" w:type="dxa"/>
+            <w:tcW w:w="1990" w:type="dxa"/>
             <w:tcBorders>
               <w:left w:val="single" w:sz="4" w:space="0" w:color="000000"/>
               <w:bottom w:val="single" w:sz="4" w:space="0" w:color="000000"/>
@@ -2566,7 +2566,7 @@
         </w:tc>
         <w:tc>
           <w:tcPr>
-            <w:tcW w:w="1998" w:type="dxa"/>
+            <w:tcW w:w="1999" w:type="dxa"/>
             <w:tcBorders>
               <w:left w:val="single" w:sz="4" w:space="0" w:color="000000"/>
               <w:bottom w:val="single" w:sz="4" w:space="0" w:color="000000"/>
@@ -2610,7 +2610,7 @@
         </w:tc>
         <w:tc>
           <w:tcPr>
-            <w:tcW w:w="1991" w:type="dxa"/>
+            <w:tcW w:w="1990" w:type="dxa"/>
             <w:tcBorders>
               <w:left w:val="single" w:sz="4" w:space="0" w:color="000000"/>
               <w:bottom w:val="single" w:sz="4" w:space="0" w:color="000000"/>
@@ -2630,7 +2630,7 @@
         </w:tc>
         <w:tc>
           <w:tcPr>
-            <w:tcW w:w="1998" w:type="dxa"/>
+            <w:tcW w:w="1999" w:type="dxa"/>
             <w:tcBorders>
               <w:left w:val="single" w:sz="4" w:space="0" w:color="000000"/>
               <w:bottom w:val="single" w:sz="4" w:space="0" w:color="000000"/>
@@ -2650,7 +2650,7 @@
         </w:tc>
         <w:tc>
           <w:tcPr>
-            <w:tcW w:w="1991" w:type="dxa"/>
+            <w:tcW w:w="1990" w:type="dxa"/>
             <w:tcBorders>
               <w:left w:val="single" w:sz="4" w:space="0" w:color="000000"/>
               <w:bottom w:val="single" w:sz="4" w:space="0" w:color="000000"/>
@@ -2670,7 +2670,7 @@
         </w:tc>
         <w:tc>
           <w:tcPr>
-            <w:tcW w:w="1998" w:type="dxa"/>
+            <w:tcW w:w="1999" w:type="dxa"/>
             <w:tcBorders>
               <w:left w:val="single" w:sz="4" w:space="0" w:color="000000"/>
               <w:bottom w:val="single" w:sz="4" w:space="0" w:color="000000"/>
@@ -2714,7 +2714,7 @@
         </w:tc>
         <w:tc>
           <w:tcPr>
-            <w:tcW w:w="1991" w:type="dxa"/>
+            <w:tcW w:w="1990" w:type="dxa"/>
             <w:tcBorders>
               <w:left w:val="single" w:sz="4" w:space="0" w:color="000000"/>
               <w:bottom w:val="single" w:sz="4" w:space="0" w:color="000000"/>
@@ -2734,7 +2734,7 @@
         </w:tc>
         <w:tc>
           <w:tcPr>
-            <w:tcW w:w="1998" w:type="dxa"/>
+            <w:tcW w:w="1999" w:type="dxa"/>
             <w:tcBorders>
               <w:left w:val="single" w:sz="4" w:space="0" w:color="000000"/>
               <w:bottom w:val="single" w:sz="4" w:space="0" w:color="000000"/>
@@ -2754,7 +2754,7 @@
         </w:tc>
         <w:tc>
           <w:tcPr>
-            <w:tcW w:w="1991" w:type="dxa"/>
+            <w:tcW w:w="1990" w:type="dxa"/>
             <w:tcBorders>
               <w:left w:val="single" w:sz="4" w:space="0" w:color="000000"/>
               <w:bottom w:val="single" w:sz="4" w:space="0" w:color="000000"/>
@@ -2774,7 +2774,7 @@
         </w:tc>
         <w:tc>
           <w:tcPr>
-            <w:tcW w:w="1998" w:type="dxa"/>
+            <w:tcW w:w="1999" w:type="dxa"/>
             <w:tcBorders>
               <w:left w:val="single" w:sz="4" w:space="0" w:color="000000"/>
               <w:bottom w:val="single" w:sz="4" w:space="0" w:color="000000"/>
@@ -2818,7 +2818,7 @@
         </w:tc>
         <w:tc>
           <w:tcPr>
-            <w:tcW w:w="1991" w:type="dxa"/>
+            <w:tcW w:w="1990" w:type="dxa"/>
             <w:tcBorders>
               <w:left w:val="single" w:sz="4" w:space="0" w:color="000000"/>
               <w:bottom w:val="single" w:sz="4" w:space="0" w:color="000000"/>
@@ -2838,7 +2838,7 @@
         </w:tc>
         <w:tc>
           <w:tcPr>
-            <w:tcW w:w="1998" w:type="dxa"/>
+            <w:tcW w:w="1999" w:type="dxa"/>
             <w:tcBorders>
               <w:left w:val="single" w:sz="4" w:space="0" w:color="000000"/>
               <w:bottom w:val="single" w:sz="4" w:space="0" w:color="000000"/>
@@ -2858,7 +2858,7 @@
         </w:tc>
         <w:tc>
           <w:tcPr>
-            <w:tcW w:w="1991" w:type="dxa"/>
+            <w:tcW w:w="1990" w:type="dxa"/>
             <w:tcBorders>
               <w:left w:val="single" w:sz="4" w:space="0" w:color="000000"/>
               <w:bottom w:val="single" w:sz="4" w:space="0" w:color="000000"/>
@@ -2878,7 +2878,7 @@
         </w:tc>
         <w:tc>
           <w:tcPr>
-            <w:tcW w:w="1998" w:type="dxa"/>
+            <w:tcW w:w="1999" w:type="dxa"/>
             <w:tcBorders>
               <w:left w:val="single" w:sz="4" w:space="0" w:color="000000"/>
               <w:bottom w:val="single" w:sz="4" w:space="0" w:color="000000"/>
@@ -2922,7 +2922,7 @@
         </w:tc>
         <w:tc>
           <w:tcPr>
-            <w:tcW w:w="1991" w:type="dxa"/>
+            <w:tcW w:w="1990" w:type="dxa"/>
             <w:tcBorders>
               <w:left w:val="single" w:sz="4" w:space="0" w:color="000000"/>
               <w:bottom w:val="single" w:sz="4" w:space="0" w:color="000000"/>
@@ -2942,7 +2942,7 @@
         </w:tc>
         <w:tc>
           <w:tcPr>
-            <w:tcW w:w="1998" w:type="dxa"/>
+            <w:tcW w:w="1999" w:type="dxa"/>
             <w:tcBorders>
               <w:left w:val="single" w:sz="4" w:space="0" w:color="000000"/>
               <w:bottom w:val="single" w:sz="4" w:space="0" w:color="000000"/>
@@ -2962,7 +2962,7 @@
         </w:tc>
         <w:tc>
           <w:tcPr>
-            <w:tcW w:w="1991" w:type="dxa"/>
+            <w:tcW w:w="1990" w:type="dxa"/>
             <w:tcBorders>
               <w:left w:val="single" w:sz="4" w:space="0" w:color="000000"/>
               <w:bottom w:val="single" w:sz="4" w:space="0" w:color="000000"/>
@@ -2982,7 +2982,7 @@
         </w:tc>
         <w:tc>
           <w:tcPr>
-            <w:tcW w:w="1998" w:type="dxa"/>
+            <w:tcW w:w="1999" w:type="dxa"/>
             <w:tcBorders>
               <w:left w:val="single" w:sz="4" w:space="0" w:color="000000"/>
               <w:bottom w:val="single" w:sz="4" w:space="0" w:color="000000"/>
@@ -3026,7 +3026,7 @@
         </w:tc>
         <w:tc>
           <w:tcPr>
-            <w:tcW w:w="1991" w:type="dxa"/>
+            <w:tcW w:w="1990" w:type="dxa"/>
             <w:tcBorders>
               <w:left w:val="single" w:sz="4" w:space="0" w:color="000000"/>
               <w:bottom w:val="single" w:sz="4" w:space="0" w:color="000000"/>
@@ -3046,7 +3046,7 @@
         </w:tc>
         <w:tc>
           <w:tcPr>
-            <w:tcW w:w="1998" w:type="dxa"/>
+            <w:tcW w:w="1999" w:type="dxa"/>
             <w:tcBorders>
               <w:left w:val="single" w:sz="4" w:space="0" w:color="000000"/>
               <w:bottom w:val="single" w:sz="4" w:space="0" w:color="000000"/>
@@ -3066,7 +3066,7 @@
         </w:tc>
         <w:tc>
           <w:tcPr>
-            <w:tcW w:w="1991" w:type="dxa"/>
+            <w:tcW w:w="1990" w:type="dxa"/>
             <w:tcBorders>
               <w:left w:val="single" w:sz="4" w:space="0" w:color="000000"/>
               <w:bottom w:val="single" w:sz="4" w:space="0" w:color="000000"/>
@@ -3086,7 +3086,7 @@
         </w:tc>
         <w:tc>
           <w:tcPr>
-            <w:tcW w:w="1998" w:type="dxa"/>
+            <w:tcW w:w="1999" w:type="dxa"/>
             <w:tcBorders>
               <w:left w:val="single" w:sz="4" w:space="0" w:color="000000"/>
               <w:bottom w:val="single" w:sz="4" w:space="0" w:color="000000"/>

</xml_diff>